<commit_message>
alhamdulillah sudah ambil ijazah
</commit_message>
<xml_diff>
--- a/administrasi/Formulir Kelulusan dan syarat ijazah/Form Pengambilan Ijazah - Teguh Agung Prabowo - 512121230007.docx
+++ b/administrasi/Formulir Kelulusan dan syarat ijazah/Form Pengambilan Ijazah - Teguh Agung Prabowo - 512121230007.docx
@@ -60,6 +60,14 @@
         </w:drawing>
       </w:r>
       <w:r>
+        <w:rPr>
+          <w:noProof/>
+        </w:rPr>
+      </w:r>
+      <w:r>
+        <w:rPr>
+          <w:noProof/>
+        </w:rPr>
         <w:pict w14:anchorId="1BAC8E55">
           <v:shapetype id="_x0000_t202" coordsize="21600,21600" o:spt="202" path="m,l,21600r21600,l21600,xe">
             <v:stroke joinstyle="miter"/>
@@ -3124,6 +3132,54 @@
                 <w:sz w:val="16"/>
               </w:rPr>
             </w:pPr>
+            <w:r>
+              <w:rPr>
+                <w:rFonts w:ascii="Times New Roman"/>
+                <w:noProof/>
+                <w:sz w:val="16"/>
+              </w:rPr>
+              <w:drawing>
+                <wp:inline distT="0" distB="0" distL="0" distR="0" wp14:anchorId="156A34C0" wp14:editId="26767475">
+                  <wp:extent cx="481330" cy="511175"/>
+                  <wp:effectExtent l="0" t="0" r="1270" b="0"/>
+                  <wp:docPr id="5" name="Picture 5"/>
+                  <wp:cNvGraphicFramePr>
+                    <a:graphicFrameLocks xmlns:a="http://schemas.openxmlformats.org/drawingml/2006/main" noChangeAspect="1"/>
+                  </wp:cNvGraphicFramePr>
+                  <a:graphic xmlns:a="http://schemas.openxmlformats.org/drawingml/2006/main">
+                    <a:graphicData uri="http://schemas.openxmlformats.org/drawingml/2006/picture">
+                      <pic:pic xmlns:pic="http://schemas.openxmlformats.org/drawingml/2006/picture">
+                        <pic:nvPicPr>
+                          <pic:cNvPr id="5" name="Picture 5"/>
+                          <pic:cNvPicPr/>
+                        </pic:nvPicPr>
+                        <pic:blipFill>
+                          <a:blip r:embed="rId5" cstate="print">
+                            <a:extLst>
+                              <a:ext uri="{28A0092B-C50C-407E-A947-70E740481C1C}">
+                                <a14:useLocalDpi xmlns:a14="http://schemas.microsoft.com/office/drawing/2010/main" val="0"/>
+                              </a:ext>
+                            </a:extLst>
+                          </a:blip>
+                          <a:stretch>
+                            <a:fillRect/>
+                          </a:stretch>
+                        </pic:blipFill>
+                        <pic:spPr>
+                          <a:xfrm>
+                            <a:off x="0" y="0"/>
+                            <a:ext cx="481330" cy="511175"/>
+                          </a:xfrm>
+                          <a:prstGeom prst="rect">
+                            <a:avLst/>
+                          </a:prstGeom>
+                        </pic:spPr>
+                      </pic:pic>
+                    </a:graphicData>
+                  </a:graphic>
+                </wp:inline>
+              </w:drawing>
+            </w:r>
           </w:p>
         </w:tc>
       </w:tr>
@@ -4168,7 +4224,7 @@
                     <pic:cNvPicPr/>
                   </pic:nvPicPr>
                   <pic:blipFill>
-                    <a:blip r:embed="rId5" cstate="print">
+                    <a:blip r:embed="rId6" cstate="print">
                       <a:extLst>
                         <a:ext uri="{28A0092B-C50C-407E-A947-70E740481C1C}">
                           <a14:useLocalDpi xmlns:a14="http://schemas.microsoft.com/office/drawing/2010/main" val="0"/>

</xml_diff>